<commit_message>
Übersicht aktualisiert (Fall 8–10, Band 9–10)
Co-Authored-By: Claude Opus 5.5 <noreply@anthropic.com>
Claude-Session: https://claude.ai/code/session_01Rqm6WzG9kWnhYjBnATSipi
</commit_message>
<xml_diff>
--- a/downloads/Uebersicht-und-Anleitung.docx
+++ b/downloads/Uebersicht-und-Anleitung.docx
@@ -232,7 +232,31 @@
         <w:pStyle w:val="ListBullet"/>
       </w:pPr>
       <w:r>
-        <w:t>Geplant: Fall 8 Kalkar (Niederrhein) – am Ende von Fall 7 angedeutet</w:t>
+        <w:t>Fall 8: Unter dem Kettenkarussell (Kalkar, Niederrhein)</w:t>
+      </w:r>
+    </w:p>
+    <w:p>
+      <w:pPr>
+        <w:pStyle w:val="ListBullet"/>
+      </w:pPr>
+      <w:r>
+        <w:t>Fall 9: Die Treppe im See (Edersee, Nordhessen)</w:t>
+      </w:r>
+    </w:p>
+    <w:p>
+      <w:pPr>
+        <w:pStyle w:val="ListBullet"/>
+      </w:pPr>
+      <w:r>
+        <w:t>Fall 10: Spind siebzehn (Prora, Rügen)</w:t>
+      </w:r>
+    </w:p>
+    <w:p>
+      <w:pPr>
+        <w:pStyle w:val="ListBullet"/>
+      </w:pPr>
+      <w:r>
+        <w:t>Geplant: Fall 11 Niederfinow (Schiffshebewerk, Brandenburg) – am Ende von Fall 10 angedeutet</w:t>
       </w:r>
     </w:p>
     <w:p>
@@ -312,7 +336,23 @@
         <w:pStyle w:val="ListBullet"/>
       </w:pPr>
       <w:r>
-        <w:t>Geplant: Band 9 Leerstand – Leuchtturm auf einer Hallig, Wärter 1979 verschwunden, jetzt Licht im Haus (am Ende von Band 8 angedeutet)</w:t>
+        <w:t>Band 9: Leerstand (Leuchtturm, Hallig)</w:t>
+      </w:r>
+    </w:p>
+    <w:p>
+      <w:pPr>
+        <w:pStyle w:val="ListBullet"/>
+      </w:pPr>
+      <w:r>
+        <w:t>Band 10: Inventur (Puppenmanufaktur, Sonneberg)</w:t>
+      </w:r>
+    </w:p>
+    <w:p>
+      <w:pPr>
+        <w:pStyle w:val="ListBullet"/>
+      </w:pPr>
+      <w:r>
+        <w:t>Geplant: Band 11 Nachlass – Weinkeller an der Mosel, Flasche Jahrgang 1945 von einem abgebrannten Weingut (am Ende von Band 10 angedeutet)</w:t>
       </w:r>
     </w:p>
     <w:p>
@@ -720,7 +760,7 @@
         <w:rPr>
           <w:b w:val="0"/>
         </w:rPr>
-        <w:t>„Schreibe Band 9 der Krimireihe ‚Alles muss raus – Ein Krimi zum Mitraten‘ von Jette van Hoven. Titel: Leerstand. Ort: Leuchtturm auf einer Hallig an der Nordsee, der Wärter ist 1979 in einer Sturmflutnacht verschwunden, seitdem ist das Haus verschlossen, jetzt brennt nachts Licht. Halte dich genau an diese Anleitung (Abschnitt 4): Figuren, Aufbau mit 14 Kapiteln, ca. 15.000 Wörter, 7 bis 10 Dokumente zum Mitraten, 6 Bildplätze, Seite ‚Jetzt bist du dran‘ mit 6 Fragen, ‚Bettys Liste‘ als Tabelle, Ende mit Anruf zum nächsten Band. Gemütlich, humorvoll, faires Rätsel, keine Hexen, keine giftigen Pflanzen, unauffällig vegan. Deutsch, einfache klare Sätze, Du-Form nur in der Rätselseite.“</w:t>
+        <w:t>„Schreibe Band 11 der Krimireihe ‚Alles muss raus – Ein Krimi zum Mitraten‘ von Jette van Hoven. Titel: Nachlass. Ort: ein dreihundert Jahre alter Weinkeller bei Bernkastel an der Mosel; der Winzer ist mit 95 gestorben, hinter einer Wand liegt eine Flasche Jahrgang 1945 von einem Weingut, das 1944 abgebrannt ist. Auf dem Armaturenbrett des Kuckucks sitzen jetzt die Kuckucksuhr, ein geschnitzter Vogel und ein Glasauge aus Lauscha. Halte dich genau an diese Anleitung (Abschnitt 4): Figuren, Aufbau mit 14 Kapiteln, ca. 15.000 Wörter, 7 bis 10 Dokumente zum Mitraten, 6 Bildplätze, Seite ‚Jetzt bist du dran‘ mit 6 Fragen, ‚Bettys Liste‘ als Tabelle, Ende mit Anruf zum nächsten Band. Gemütlich, humorvoll, faires Rätsel, keine Hexen, keine giftigen Pflanzen, unauffällig vegan. Deutsch, einfache klare Sätze, Du-Form nur in der Rätselseite.“</w:t>
       </w:r>
     </w:p>
     <w:p>
@@ -728,7 +768,7 @@
         <w:rPr>
           <w:b w:val="0"/>
         </w:rPr>
-        <w:t>Dasselbe geht für „Mit Gardinen ins Jenseits“, Fall 8 Kalkar, mit Abschnitt 5.</w:t>
+        <w:t>Dasselbe geht für „Mit Gardinen ins Jenseits“, Fall 11 Niederfinow (Schiffshebewerk, ein 1962 versenkter Lastkahn „Wilhelmine“), mit Abschnitt 5.</w:t>
       </w:r>
     </w:p>
     <w:p>

</xml_diff>

<commit_message>
Gardinen Fall 11: Die Wilhelmine (Niederfinow); Übersicht aktualisiert
Co-Authored-By: Claude Opus 5.5 <noreply@anthropic.com>
Claude-Session: https://claude.ai/code/session_01Rqm6WzG9kWnhYjBnATSipi
</commit_message>
<xml_diff>
--- a/downloads/Uebersicht-und-Anleitung.docx
+++ b/downloads/Uebersicht-und-Anleitung.docx
@@ -256,7 +256,15 @@
         <w:pStyle w:val="ListBullet"/>
       </w:pPr>
       <w:r>
-        <w:t>Geplant: Fall 11 Niederfinow (Schiffshebewerk, Brandenburg) – am Ende von Fall 10 angedeutet</w:t>
+        <w:t>Fall 11: Die Wilhelmine (Niederfinow, Brandenburg)</w:t>
+      </w:r>
+    </w:p>
+    <w:p>
+      <w:pPr>
+        <w:pStyle w:val="ListBullet"/>
+      </w:pPr>
+      <w:r>
+        <w:t>Geplant: Fall 12 Goslar (Rammelsberg, Markenbrett, Marke 117) – am Ende von Fall 11 angedeutet</w:t>
       </w:r>
     </w:p>
     <w:p>
@@ -352,7 +360,15 @@
         <w:pStyle w:val="ListBullet"/>
       </w:pPr>
       <w:r>
-        <w:t>Geplant: Band 11 Nachlass – Weinkeller an der Mosel, Flasche Jahrgang 1945 von einem abgebrannten Weingut (am Ende von Band 10 angedeutet)</w:t>
+        <w:t>Band 11: Nachlass (Weinkeller, Mosel)</w:t>
+      </w:r>
+    </w:p>
+    <w:p>
+      <w:pPr>
+        <w:pStyle w:val="ListBullet"/>
+      </w:pPr>
+      <w:r>
+        <w:t>Geplant: Band 12 Ausverkauft – Zirkus-Winterquartier in der Lüneburger Heide, Wagen 12 der Seiltänzerin (am Ende von Band 11 angedeutet)</w:t>
       </w:r>
     </w:p>
     <w:p>
@@ -760,7 +776,7 @@
         <w:rPr>
           <w:b w:val="0"/>
         </w:rPr>
-        <w:t>„Schreibe Band 11 der Krimireihe ‚Alles muss raus – Ein Krimi zum Mitraten‘ von Jette van Hoven. Titel: Nachlass. Ort: ein dreihundert Jahre alter Weinkeller bei Bernkastel an der Mosel; der Winzer ist mit 95 gestorben, hinter einer Wand liegt eine Flasche Jahrgang 1945 von einem Weingut, das 1944 abgebrannt ist. Auf dem Armaturenbrett des Kuckucks sitzen jetzt die Kuckucksuhr, ein geschnitzter Vogel und ein Glasauge aus Lauscha. Halte dich genau an diese Anleitung (Abschnitt 4): Figuren, Aufbau mit 14 Kapiteln, ca. 15.000 Wörter, 7 bis 10 Dokumente zum Mitraten, 6 Bildplätze, Seite ‚Jetzt bist du dran‘ mit 6 Fragen, ‚Bettys Liste‘ als Tabelle, Ende mit Anruf zum nächsten Band. Gemütlich, humorvoll, faires Rätsel, keine Hexen, keine giftigen Pflanzen, unauffällig vegan. Deutsch, einfache klare Sätze, Du-Form nur in der Rätselseite.“</w:t>
+        <w:t>„Schreibe Band 12 der Krimireihe ‚Alles muss raus – Ein Krimi zum Mitraten‘ von Jette van Hoven. Titel: Ausverkauft. Ort: ein Zirkus-Winterquartier der Familie Karoli bei Celle in der Lüneburger Heide; zwölf Wagen, Wagen zwölf gehörte der Seiltänzerin, die 1989 in der letzten Vorstellung abgestürzt ist, seitdem ist er zu, und letzte Woche hat jemand von innen ans Fenster geklopft. Auf dem Armaturenbrett des Kuckucks sitzen jetzt die Kuckucksuhr, ein geschnitzter Vogel und ein Glasauge aus Lauscha. Halte dich genau an diese Anleitung (Abschnitt 4): Figuren, Aufbau mit 14 Kapiteln, ca. 15.000 Wörter, 7 bis 10 Dokumente zum Mitraten, 6 Bildplätze, Seite ‚Jetzt bist du dran‘ mit 6 Fragen, ‚Bettys Liste‘ als Tabelle, Ende mit Anruf zum nächsten Band. Gemütlich, humorvoll, faires Rätsel, keine Hexen, keine giftigen Pflanzen, unauffällig vegan. Deutsch, einfache klare Sätze, Du-Form nur in der Rätselseite.“</w:t>
       </w:r>
     </w:p>
     <w:p>
@@ -768,7 +784,7 @@
         <w:rPr>
           <w:b w:val="0"/>
         </w:rPr>
-        <w:t>Dasselbe geht für „Mit Gardinen ins Jenseits“, Fall 11 Niederfinow (Schiffshebewerk, ein 1962 versenkter Lastkahn „Wilhelmine“), mit Abschnitt 5.</w:t>
+        <w:t>Dasselbe geht für „Mit Gardinen ins Jenseits“, Fall 12 Goslar (Bergwerk Rammelsberg, am Markenbrett fehlt seit 1988 die Marke Nr. 117), mit Abschnitt 5.</w:t>
       </w:r>
     </w:p>
     <w:p>

</xml_diff>

<commit_message>
Alles muss raus Band 12: Ausverkauft (Zirkus, Heide); Übersicht aktualisiert
Co-Authored-By: Claude Opus 5.5 <noreply@anthropic.com>
Claude-Session: https://claude.ai/code/session_01Rqm6WzG9kWnhYjBnATSipi
</commit_message>
<xml_diff>
--- a/downloads/Uebersicht-und-Anleitung.docx
+++ b/downloads/Uebersicht-und-Anleitung.docx
@@ -368,7 +368,15 @@
         <w:pStyle w:val="ListBullet"/>
       </w:pPr>
       <w:r>
-        <w:t>Geplant: Band 12 Ausverkauft – Zirkus-Winterquartier in der Lüneburger Heide, Wagen 12 der Seiltänzerin (am Ende von Band 11 angedeutet)</w:t>
+        <w:t>Band 12: Ausverkauft (Zirkus-Winterquartier, Lüneburger Heide)</w:t>
+      </w:r>
+    </w:p>
+    <w:p>
+      <w:pPr>
+        <w:pStyle w:val="ListBullet"/>
+      </w:pPr>
+      <w:r>
+        <w:t>Geplant: Band 13 Schlussverkauf – Kaufhaus in Görlitz, alter Aufzug fährt ohne Strom (am Ende von Band 12 angedeutet)</w:t>
       </w:r>
     </w:p>
     <w:p>
@@ -776,7 +784,7 @@
         <w:rPr>
           <w:b w:val="0"/>
         </w:rPr>
-        <w:t>„Schreibe Band 12 der Krimireihe ‚Alles muss raus – Ein Krimi zum Mitraten‘ von Jette van Hoven. Titel: Ausverkauft. Ort: ein Zirkus-Winterquartier der Familie Karoli bei Celle in der Lüneburger Heide; zwölf Wagen, Wagen zwölf gehörte der Seiltänzerin, die 1989 in der letzten Vorstellung abgestürzt ist, seitdem ist er zu, und letzte Woche hat jemand von innen ans Fenster geklopft. Auf dem Armaturenbrett des Kuckucks sitzen jetzt die Kuckucksuhr, ein geschnitzter Vogel und ein Glasauge aus Lauscha. Halte dich genau an diese Anleitung (Abschnitt 4): Figuren, Aufbau mit 14 Kapiteln, ca. 15.000 Wörter, 7 bis 10 Dokumente zum Mitraten, 6 Bildplätze, Seite ‚Jetzt bist du dran‘ mit 6 Fragen, ‚Bettys Liste‘ als Tabelle, Ende mit Anruf zum nächsten Band. Gemütlich, humorvoll, faires Rätsel, keine Hexen, keine giftigen Pflanzen, unauffällig vegan. Deutsch, einfache klare Sätze, Du-Form nur in der Rätselseite.“</w:t>
+        <w:t>„Schreibe Band 13 der Krimireihe ‚Alles muss raus – Ein Krimi zum Mitraten‘ von Jette van Hoven. Titel: Schlussverkauf. Ort: ein Kaufhaus in Görlitz mit fünf Stockwerken und Lichthof aus Glas, seit 2009 geschlossen; der alte Messing-Gitteraufzug hat seit sechzehn Jahren das Schild Außer Betrieb, der Strom ist abgestellt, und gestern Nacht ist er vom fünften Stock nach unten gefahren. Auf dem Armaturenbrett des Kuckucks sitzen jetzt die Kuckucksuhr, ein geschnitzter Vogel und ein Glasauge aus Lauscha. Halte dich genau an diese Anleitung (Abschnitt 4): Figuren, Aufbau mit 14 Kapiteln, ca. 15.000 Wörter, 7 bis 10 Dokumente zum Mitraten, 6 Bildplätze, Seite ‚Jetzt bist du dran‘ mit 6 Fragen, ‚Bettys Liste‘ als Tabelle, Ende mit Anruf zum nächsten Band. Gemütlich, humorvoll, faires Rätsel, keine Hexen, keine giftigen Pflanzen, unauffällig vegan. Deutsch, einfache klare Sätze, Du-Form nur in der Rätselseite.“</w:t>
       </w:r>
     </w:p>
     <w:p>

</xml_diff>

<commit_message>
Gardinen Fall 12: Die letzte Marke (Goslar); Übersicht aktualisiert
Co-Authored-By: Claude Opus 5.5 <noreply@anthropic.com>
Claude-Session: https://claude.ai/code/session_01Rqm6WzG9kWnhYjBnATSipi
</commit_message>
<xml_diff>
--- a/downloads/Uebersicht-und-Anleitung.docx
+++ b/downloads/Uebersicht-und-Anleitung.docx
@@ -264,7 +264,15 @@
         <w:pStyle w:val="ListBullet"/>
       </w:pPr>
       <w:r>
-        <w:t>Geplant: Fall 12 Goslar (Rammelsberg, Markenbrett, Marke 117) – am Ende von Fall 11 angedeutet</w:t>
+        <w:t>Fall 12: Die letzte Marke (Goslar, Rammelsberg)</w:t>
+      </w:r>
+    </w:p>
+    <w:p>
+      <w:pPr>
+        <w:pStyle w:val="ListBullet"/>
+      </w:pPr>
+      <w:r>
+        <w:t>Geplant: Fall 13 Hamburg (Alter Elbtunnel, ein grüner Käfer von 1975) – am Ende von Fall 12 angedeutet</w:t>
       </w:r>
     </w:p>
     <w:p>
@@ -792,7 +800,7 @@
         <w:rPr>
           <w:b w:val="0"/>
         </w:rPr>
-        <w:t>Dasselbe geht für „Mit Gardinen ins Jenseits“, Fall 12 Goslar (Bergwerk Rammelsberg, am Markenbrett fehlt seit 1988 die Marke Nr. 117), mit Abschnitt 5.</w:t>
+        <w:t>Dasselbe geht für „Mit Gardinen ins Jenseits“, Fall 13 Hamburg (Alter Elbtunnel, Fahrkorb, ein grüner VW Käfer fährt 1975 hinunter und kommt nie wieder hoch), mit Abschnitt 5.</w:t>
       </w:r>
     </w:p>
     <w:p>

</xml_diff>

<commit_message>
Alles muss raus Band 13: Schlussverkauf (Görlitz), ZIPs und Übersicht aktualisiert
Co-Authored-By: Claude Opus 5.5 <noreply@anthropic.com>
Claude-Session: https://claude.ai/code/session_01Rqm6WzG9kWnhYjBnATSipi
</commit_message>
<xml_diff>
--- a/downloads/Uebersicht-und-Anleitung.docx
+++ b/downloads/Uebersicht-und-Anleitung.docx
@@ -384,7 +384,15 @@
         <w:pStyle w:val="ListBullet"/>
       </w:pPr>
       <w:r>
-        <w:t>Geplant: Band 13 Schlussverkauf – Kaufhaus in Görlitz, alter Aufzug fährt ohne Strom (am Ende von Band 12 angedeutet)</w:t>
+        <w:t>Band 13: Schlussverkauf (Kaufhaus, Görlitz)</w:t>
+      </w:r>
+    </w:p>
+    <w:p>
+      <w:pPr>
+        <w:pStyle w:val="ListBullet"/>
+      </w:pPr>
+      <w:r>
+        <w:t>Geplant: Band 14 Zimmer frei – Pension auf der Insel Lindau, Zimmer sieben nie vermietet (am Ende von Band 13 angedeutet)</w:t>
       </w:r>
     </w:p>
     <w:p>
@@ -792,7 +800,7 @@
         <w:rPr>
           <w:b w:val="0"/>
         </w:rPr>
-        <w:t>„Schreibe Band 13 der Krimireihe ‚Alles muss raus – Ein Krimi zum Mitraten‘ von Jette van Hoven. Titel: Schlussverkauf. Ort: ein Kaufhaus in Görlitz mit fünf Stockwerken und Lichthof aus Glas, seit 2009 geschlossen; der alte Messing-Gitteraufzug hat seit sechzehn Jahren das Schild Außer Betrieb, der Strom ist abgestellt, und gestern Nacht ist er vom fünften Stock nach unten gefahren. Auf dem Armaturenbrett des Kuckucks sitzen jetzt die Kuckucksuhr, ein geschnitzter Vogel und ein Glasauge aus Lauscha. Halte dich genau an diese Anleitung (Abschnitt 4): Figuren, Aufbau mit 14 Kapiteln, ca. 15.000 Wörter, 7 bis 10 Dokumente zum Mitraten, 6 Bildplätze, Seite ‚Jetzt bist du dran‘ mit 6 Fragen, ‚Bettys Liste‘ als Tabelle, Ende mit Anruf zum nächsten Band. Gemütlich, humorvoll, faires Rätsel, keine Hexen, keine giftigen Pflanzen, unauffällig vegan. Deutsch, einfache klare Sätze, Du-Form nur in der Rätselseite.“</w:t>
+        <w:t>„Schreibe Band 14 der Krimireihe ‚Alles muss raus – Ein Krimi zum Mitraten‘ von Jette van Hoven. Titel: Zimmer frei. Ort: eine Pension auf der Insel Lindau im Bodensee, direkt am Hafen, seit 1970 geschlossen; die Tante des Anrufers ist mit 102 gestorben, Zimmer sieben hat sie fünfundfünfzig Jahre lang nie vermietet und trotzdem jeden Morgen das Bett frisch gemacht, und jetzt liegt darauf ein neuer Rettungsring mit dem Namen eines Schiffs, das 1970 im See untergegangen ist. Auf dem Armaturenbrett des Kuckucks sitzen jetzt die Kuckucksuhr, ein geschnitzter Vogel, ein Glasauge aus Lauscha, ein Seiltänzer-Gartenzwerg und ein Messingknopf mit Pfeil nach unten. Halte dich genau an diese Anleitung (Abschnitt 4): Figuren, Aufbau mit 14 Kapiteln, ca. 15.000 Wörter, 7 bis 10 Dokumente zum Mitraten, 6 Bildplätze, Seite ‚Jetzt bist du dran‘ mit 6 Fragen, ‚Bettys Liste‘ als Tabelle, Ende mit Anruf zum nächsten Band. Gemütlich, humorvoll, faires Rätsel, keine Hexen, keine giftigen Pflanzen, unauffällig vegan. Deutsch, einfache klare Sätze, Du-Form nur in der Rätselseite.“</w:t>
       </w:r>
     </w:p>
     <w:p>

</xml_diff>

<commit_message>
Mit Gardinen ins Jenseits Fall 13: Findet den Käfer (Hamburg), ZIPs und Übersicht aktualisiert
Co-Authored-By: Claude Opus 5.5 <noreply@anthropic.com>
Claude-Session: https://claude.ai/code/session_01Rqm6WzG9kWnhYjBnATSipi
</commit_message>
<xml_diff>
--- a/downloads/Uebersicht-und-Anleitung.docx
+++ b/downloads/Uebersicht-und-Anleitung.docx
@@ -272,7 +272,15 @@
         <w:pStyle w:val="ListBullet"/>
       </w:pPr>
       <w:r>
-        <w:t>Geplant: Fall 13 Hamburg (Alter Elbtunnel, ein grüner Käfer von 1975) – am Ende von Fall 12 angedeutet</w:t>
+        <w:t>Fall 13: Findet den Käfer (Hamburg, Alter Elbtunnel)</w:t>
+      </w:r>
+    </w:p>
+    <w:p>
+      <w:pPr>
+        <w:pStyle w:val="ListBullet"/>
+      </w:pPr>
+      <w:r>
+        <w:t>Geplant: Fall 14 Wuppertal (Schwebebahn, 1950: ein Elefant springt, ein Mann steigt nie aus) – am Ende von Fall 13 angedeutet</w:t>
       </w:r>
     </w:p>
     <w:p>
@@ -808,7 +816,7 @@
         <w:rPr>
           <w:b w:val="0"/>
         </w:rPr>
-        <w:t>Dasselbe geht für „Mit Gardinen ins Jenseits“, Fall 13 Hamburg (Alter Elbtunnel, Fahrkorb, ein grüner VW Käfer fährt 1975 hinunter und kommt nie wieder hoch), mit Abschnitt 5.</w:t>
+        <w:t>Dasselbe geht für „Mit Gardinen ins Jenseits“, Fall 14 Wuppertal (Schwebebahn; im Juli 1950 springt der Zirkuselefant Tuffi aus dem Wagen in die Wupper, und im selben Wagen sitzt ein Mann, der an keiner Station aussteigt), mit Abschnitt 5.</w:t>
       </w:r>
     </w:p>
     <w:p>

</xml_diff>

<commit_message>
Alles muss raus Band 14: Zimmer frei (Lindau), ZIPs und Übersicht aktualisiert
Co-Authored-By: Claude Opus 5.5 <noreply@anthropic.com>
Claude-Session: https://claude.ai/code/session_01Rqm6WzG9kWnhYjBnATSipi
</commit_message>
<xml_diff>
--- a/downloads/Uebersicht-und-Anleitung.docx
+++ b/downloads/Uebersicht-und-Anleitung.docx
@@ -400,7 +400,15 @@
         <w:pStyle w:val="ListBullet"/>
       </w:pPr>
       <w:r>
-        <w:t>Geplant: Band 14 Zimmer frei – Pension auf der Insel Lindau, Zimmer sieben nie vermietet (am Ende von Band 13 angedeutet)</w:t>
+        <w:t>Band 14: Zimmer frei (Pension, Lindau)</w:t>
+      </w:r>
+    </w:p>
+    <w:p>
+      <w:pPr>
+        <w:pStyle w:val="ListBullet"/>
+      </w:pPr>
+      <w:r>
+        <w:t>Geplant: Band 15 Unter den Hammer – Windmühle in Ostfriesland dreht sich gegen den Wind (am Ende von Band 14 angedeutet)</w:t>
       </w:r>
     </w:p>
     <w:p>
@@ -808,7 +816,7 @@
         <w:rPr>
           <w:b w:val="0"/>
         </w:rPr>
-        <w:t>„Schreibe Band 14 der Krimireihe ‚Alles muss raus – Ein Krimi zum Mitraten‘ von Jette van Hoven. Titel: Zimmer frei. Ort: eine Pension auf der Insel Lindau im Bodensee, direkt am Hafen, seit 1970 geschlossen; die Tante des Anrufers ist mit 102 gestorben, Zimmer sieben hat sie fünfundfünfzig Jahre lang nie vermietet und trotzdem jeden Morgen das Bett frisch gemacht, und jetzt liegt darauf ein neuer Rettungsring mit dem Namen eines Schiffs, das 1970 im See untergegangen ist. Auf dem Armaturenbrett des Kuckucks sitzen jetzt die Kuckucksuhr, ein geschnitzter Vogel, ein Glasauge aus Lauscha, ein Seiltänzer-Gartenzwerg und ein Messingknopf mit Pfeil nach unten. Halte dich genau an diese Anleitung (Abschnitt 4): Figuren, Aufbau mit 14 Kapiteln, ca. 15.000 Wörter, 7 bis 10 Dokumente zum Mitraten, 6 Bildplätze, Seite ‚Jetzt bist du dran‘ mit 6 Fragen, ‚Bettys Liste‘ als Tabelle, Ende mit Anruf zum nächsten Band. Gemütlich, humorvoll, faires Rätsel, keine Hexen, keine giftigen Pflanzen, unauffällig vegan. Deutsch, einfache klare Sätze, Du-Form nur in der Rätselseite.“</w:t>
+        <w:t>„Schreibe Band 15 der Krimireihe ‚Alles muss raus – Ein Krimi zum Mitraten‘ von Jette van Hoven. Titel: Unter den Hammer. Ort: eine alte Windmühle (Holländer mit Galerie) im Rheiderland in Ostfriesland; seit 1981 sind die Flügel mit Ketten festgebunden, der Müller ist gestorben, und letzte Nacht hat sich die Mühle gedreht, mit den Ketten dran, gegen den Wind. Auf dem Armaturenbrett des Kuckucks sitzen jetzt die Kuckucksuhr, ein geschnitzter Vogel, ein Glasauge aus Lauscha, ein Seiltänzer-Gartenzwerg, ein Messingknopf mit Pfeil nach unten und ein kleiner Rettungsring aus Kork. Halte dich genau an diese Anleitung (Abschnitt 4): Figuren, Aufbau mit 14 Kapiteln, ca. 15.000 Wörter, 7 bis 10 Dokumente zum Mitraten, 6 Bildplätze, Seite ‚Jetzt bist du dran‘ mit 6 Fragen, ‚Bettys Liste‘ als Tabelle, Ende mit Anruf zum nächsten Band. Gemütlich, humorvoll, faires Rätsel, keine Hexen, keine giftigen Pflanzen, unauffällig vegan. Deutsch, einfache klare Sätze, Du-Form nur in der Rätselseite.“</w:t>
       </w:r>
     </w:p>
     <w:p>

</xml_diff>

<commit_message>
Mit Gardinen ins Jenseits Fall 14: Alle haben auf den Elefanten geguckt (Wuppertal), ZIPs und Übersicht aktualisiert
Co-Authored-By: Claude Opus 5.5 <noreply@anthropic.com>
Claude-Session: https://claude.ai/code/session_01Rqm6WzG9kWnhYjBnATSipi
</commit_message>
<xml_diff>
--- a/downloads/Uebersicht-und-Anleitung.docx
+++ b/downloads/Uebersicht-und-Anleitung.docx
@@ -280,7 +280,15 @@
         <w:pStyle w:val="ListBullet"/>
       </w:pPr>
       <w:r>
-        <w:t>Geplant: Fall 14 Wuppertal (Schwebebahn, 1950: ein Elefant springt, ein Mann steigt nie aus) – am Ende von Fall 13 angedeutet</w:t>
+        <w:t>Fall 14: Alle haben auf den Elefanten geguckt (Wuppertal, Schwebebahn)</w:t>
+      </w:r>
+    </w:p>
+    <w:p>
+      <w:pPr>
+        <w:pStyle w:val="ListBullet"/>
+      </w:pPr>
+      <w:r>
+        <w:t>Geplant: Fall 15 Bremerhaven (Leuchtturm Roter Sand, 1964: drei Männer raus, zwei zurück) – am Ende von Fall 14 angedeutet</w:t>
       </w:r>
     </w:p>
     <w:p>
@@ -824,7 +832,7 @@
         <w:rPr>
           <w:b w:val="0"/>
         </w:rPr>
-        <w:t>Dasselbe geht für „Mit Gardinen ins Jenseits“, Fall 14 Wuppertal (Schwebebahn; im Juli 1950 springt der Zirkuselefant Tuffi aus dem Wagen in die Wupper, und im selben Wagen sitzt ein Mann, der an keiner Station aussteigt), mit Abschnitt 5.</w:t>
+        <w:t>Dasselbe geht für „Mit Gardinen ins Jenseits“, Fall 15 Bremerhaven (Leuchtturm Roter Sand in der Wesermündung; im November 1964 fahren drei Leuchtturmwärter hinaus, zwei kommen zurück, im Logbuch steht den ganzen Monat: drei Mann an Bord; Testament: Holt ihn runter), mit Abschnitt 5.</w:t>
       </w:r>
     </w:p>
     <w:p>

</xml_diff>

<commit_message>
Alles muss raus Band 15: Unter den Hammer (Rheiderland), ZIPs und Übersicht aktualisiert
Co-Authored-By: Claude Opus 5.5 <noreply@anthropic.com>
Claude-Session: https://claude.ai/code/session_01Rqm6WzG9kWnhYjBnATSipi
</commit_message>
<xml_diff>
--- a/downloads/Uebersicht-und-Anleitung.docx
+++ b/downloads/Uebersicht-und-Anleitung.docx
@@ -416,7 +416,15 @@
         <w:pStyle w:val="ListBullet"/>
       </w:pPr>
       <w:r>
-        <w:t>Geplant: Band 15 Unter den Hammer – Windmühle in Ostfriesland dreht sich gegen den Wind (am Ende von Band 14 angedeutet)</w:t>
+        <w:t>Band 15: Unter den Hammer (Windmühle, Ostfriesland)</w:t>
+      </w:r>
+    </w:p>
+    <w:p>
+      <w:pPr>
+        <w:pStyle w:val="ListBullet"/>
+      </w:pPr>
+      <w:r>
+        <w:t>Geplant: Band 16 Restbestand – Spreewald, ein Kahn fährt nachts ohne Fährmann (am Ende von Band 15 angedeutet)</w:t>
       </w:r>
     </w:p>
     <w:p>
@@ -824,7 +832,7 @@
         <w:rPr>
           <w:b w:val="0"/>
         </w:rPr>
-        <w:t>„Schreibe Band 15 der Krimireihe ‚Alles muss raus – Ein Krimi zum Mitraten‘ von Jette van Hoven. Titel: Unter den Hammer. Ort: eine alte Windmühle (Holländer mit Galerie) im Rheiderland in Ostfriesland; seit 1981 sind die Flügel mit Ketten festgebunden, der Müller ist gestorben, und letzte Nacht hat sich die Mühle gedreht, mit den Ketten dran, gegen den Wind. Auf dem Armaturenbrett des Kuckucks sitzen jetzt die Kuckucksuhr, ein geschnitzter Vogel, ein Glasauge aus Lauscha, ein Seiltänzer-Gartenzwerg, ein Messingknopf mit Pfeil nach unten und ein kleiner Rettungsring aus Kork. Halte dich genau an diese Anleitung (Abschnitt 4): Figuren, Aufbau mit 14 Kapiteln, ca. 15.000 Wörter, 7 bis 10 Dokumente zum Mitraten, 6 Bildplätze, Seite ‚Jetzt bist du dran‘ mit 6 Fragen, ‚Bettys Liste‘ als Tabelle, Ende mit Anruf zum nächsten Band. Gemütlich, humorvoll, faires Rätsel, keine Hexen, keine giftigen Pflanzen, unauffällig vegan. Deutsch, einfache klare Sätze, Du-Form nur in der Rätselseite.“</w:t>
+        <w:t>„Schreibe Band 16 der Krimireihe ‚Alles muss raus – Ein Krimi zum Mitraten‘ von Jette van Hoven. Titel: Restbestand. Ort: Lehde im Spreewald; ein alter Fährmann ist gestorben, sein Kahn liegt seit 1989 kieloben unter einer Plane im Schuppen, und gestern früh lag er nass am Steg, mit dem Rudel (Stakstange) drin, als ob einer in der Nacht damit gefahren ist. Auf dem Armaturenbrett des Kuckucks sitzen jetzt die Kuckucksuhr, ein geschnitzter Vogel, ein Glasauge aus Lauscha, ein Seiltänzer-Gartenzwerg, ein Messingknopf mit Pfeil nach unten, ein Rettungsring aus Kork und ein Mehlsäckchen aus Leinen. Halte dich genau an diese Anleitung (Abschnitt 4): Figuren, Aufbau mit 14 Kapiteln, ca. 15.000 Wörter, 7 bis 10 Dokumente zum Mitraten, 6 Bildplätze, Seite ‚Jetzt bist du dran‘ mit 6 Fragen, ‚Bettys Liste‘ als Tabelle, Ende mit Anruf zum nächsten Band. Gemütlich, humorvoll, faires Rätsel, keine Hexen, keine giftigen Pflanzen, unauffällig vegan. Deutsch, einfache klare Sätze, Du-Form nur in der Rätselseite.“</w:t>
       </w:r>
     </w:p>
     <w:p>

</xml_diff>

<commit_message>
Mit Gardinen ins Jenseits Fall 15: Drei Mann an Bord (Roter Sand), ZIPs und Übersicht aktualisiert
Co-Authored-By: Claude Opus 5.5 <noreply@anthropic.com>
Claude-Session: https://claude.ai/code/session_01Rqm6WzG9kWnhYjBnATSipi
</commit_message>
<xml_diff>
--- a/downloads/Uebersicht-und-Anleitung.docx
+++ b/downloads/Uebersicht-und-Anleitung.docx
@@ -288,7 +288,15 @@
         <w:pStyle w:val="ListBullet"/>
       </w:pPr>
       <w:r>
-        <w:t>Geplant: Fall 15 Bremerhaven (Leuchtturm Roter Sand, 1964: drei Männer raus, zwei zurück) – am Ende von Fall 14 angedeutet</w:t>
+        <w:t>Fall 15: Drei Mann an Bord (Bremerhaven, Leuchtturm Roter Sand)</w:t>
+      </w:r>
+    </w:p>
+    <w:p>
+      <w:pPr>
+        <w:pStyle w:val="ListBullet"/>
+      </w:pPr>
+      <w:r>
+        <w:t>Geplant: Fall 16 Helgoland (1952 nach der Rückgabe vergrabene Kiste unter dem Oberland) – am Ende von Fall 15 angedeutet</w:t>
       </w:r>
     </w:p>
     <w:p>
@@ -840,7 +848,7 @@
         <w:rPr>
           <w:b w:val="0"/>
         </w:rPr>
-        <w:t>Dasselbe geht für „Mit Gardinen ins Jenseits“, Fall 15 Bremerhaven (Leuchtturm Roter Sand in der Wesermündung; im November 1964 fahren drei Leuchtturmwärter hinaus, zwei kommen zurück, im Logbuch steht den ganzen Monat: drei Mann an Bord; Testament: Holt ihn runter), mit Abschnitt 5.</w:t>
+        <w:t>Dasselbe geht für „Mit Gardinen ins Jenseits“, Fall 16 Helgoland (am 1. März 1952 geben die Briten die zerbombte Insel zurück; ein junger Hummerfischer gehört zu den Ersten an Land und vergräbt eine Kiste unter dem Oberland; Testament: Holt sie raus und gebt sie dem, dem sie gehört, es ist nicht meine), mit Abschnitt 5.</w:t>
       </w:r>
     </w:p>
     <w:p>

</xml_diff>

<commit_message>
Alles muss raus Band 16: Restbestand (Spreewald), ZIPs und Übersicht aktualisiert
Co-Authored-By: Claude Opus 5.5 <noreply@anthropic.com>
Claude-Session: https://claude.ai/code/session_01Rqm6WzG9kWnhYjBnATSipi
</commit_message>
<xml_diff>
--- a/downloads/Uebersicht-und-Anleitung.docx
+++ b/downloads/Uebersicht-und-Anleitung.docx
@@ -432,7 +432,15 @@
         <w:pStyle w:val="ListBullet"/>
       </w:pPr>
       <w:r>
-        <w:t>Geplant: Band 16 Restbestand – Spreewald, ein Kahn fährt nachts ohne Fährmann (am Ende von Band 15 angedeutet)</w:t>
+        <w:t>Band 16: Restbestand (Kahn, Spreewald)</w:t>
+      </w:r>
+    </w:p>
+    <w:p>
+      <w:pPr>
+        <w:pStyle w:val="ListBullet"/>
+      </w:pPr>
+      <w:r>
+        <w:t>Geplant: Band 17 Sonderposten – Felsenkeller in Bamberg, ein Fass läuft aus (am Ende von Band 16 angedeutet)</w:t>
       </w:r>
     </w:p>
     <w:p>
@@ -840,7 +848,7 @@
         <w:rPr>
           <w:b w:val="0"/>
         </w:rPr>
-        <w:t>„Schreibe Band 16 der Krimireihe ‚Alles muss raus – Ein Krimi zum Mitraten‘ von Jette van Hoven. Titel: Restbestand. Ort: Lehde im Spreewald; ein alter Fährmann ist gestorben, sein Kahn liegt seit 1989 kieloben unter einer Plane im Schuppen, und gestern früh lag er nass am Steg, mit dem Rudel (Stakstange) drin, als ob einer in der Nacht damit gefahren ist. Auf dem Armaturenbrett des Kuckucks sitzen jetzt die Kuckucksuhr, ein geschnitzter Vogel, ein Glasauge aus Lauscha, ein Seiltänzer-Gartenzwerg, ein Messingknopf mit Pfeil nach unten, ein Rettungsring aus Kork und ein Mehlsäckchen aus Leinen. Halte dich genau an diese Anleitung (Abschnitt 4): Figuren, Aufbau mit 14 Kapiteln, ca. 15.000 Wörter, 7 bis 10 Dokumente zum Mitraten, 6 Bildplätze, Seite ‚Jetzt bist du dran‘ mit 6 Fragen, ‚Bettys Liste‘ als Tabelle, Ende mit Anruf zum nächsten Band. Gemütlich, humorvoll, faires Rätsel, keine Hexen, keine giftigen Pflanzen, unauffällig vegan. Deutsch, einfache klare Sätze, Du-Form nur in der Rätselseite.“</w:t>
+        <w:t>„Schreibe Band 17 der Krimireihe ‚Alles muss raus – Ein Krimi zum Mitraten‘ von Jette van Hoven. Titel: Sonderposten. Ort: eine kleine Brauerei in der Altstadt von Bamberg mit einem Felsenkeller tief im Berg; ganz hinten steht ein altes Eichenfass, auf dem seit 1972 mit Kreide steht: Nicht anzapfen; der Brauer ist gestorben, und jetzt läuft das Fass aus, und es ist kein Bier. Auf dem Armaturenbrett des Kuckucks sitzen jetzt die Kuckucksuhr, ein geschnitzter Vogel, ein Glasauge aus Lauscha, ein Seiltänzer-Gartenzwerg, ein Messingknopf mit Pfeil nach unten, ein Rettungsring aus Kork, ein Mehlsäckchen und ein winziges Einweckglas mit einer Holzgurke. Halte dich genau an diese Anleitung (Abschnitt 4): Figuren, Aufbau mit 14 Kapiteln, ca. 15.000 Wörter, 7 bis 10 Dokumente zum Mitraten, 6 Bildplätze, Seite ‚Jetzt bist du dran‘ mit 6 Fragen, ‚Bettys Liste‘ als Tabelle, Ende mit Anruf zum nächsten Band. Gemütlich, humorvoll, faires Rätsel, keine Hexen, keine giftigen Pflanzen, unauffällig vegan. Deutsch, einfache klare Sätze, Du-Form nur in der Rätselseite.“</w:t>
       </w:r>
     </w:p>
     <w:p>

</xml_diff>

<commit_message>
Mit Gardinen ins Jenseits Fall 16: Es ist nicht meine (Helgoland), ZIPs und Übersicht aktualisiert
Co-Authored-By: Claude Opus 5.5 <noreply@anthropic.com>
Claude-Session: https://claude.ai/code/session_01Rqm6WzG9kWnhYjBnATSipi
</commit_message>
<xml_diff>
--- a/downloads/Uebersicht-und-Anleitung.docx
+++ b/downloads/Uebersicht-und-Anleitung.docx
@@ -296,7 +296,15 @@
         <w:pStyle w:val="ListBullet"/>
       </w:pPr>
       <w:r>
-        <w:t>Geplant: Fall 16 Helgoland (1952 nach der Rückgabe vergrabene Kiste unter dem Oberland) – am Ende von Fall 15 angedeutet</w:t>
+        <w:t>Fall 16: Es ist nicht meine (Helgoland)</w:t>
+      </w:r>
+    </w:p>
+    <w:p>
+      <w:pPr>
+        <w:pStyle w:val="ListBullet"/>
+      </w:pPr>
+      <w:r>
+        <w:t>Geplant: Fall 17 Sächsische Schweiz (Gipfelbuch auf dem Falkenstein, 1961 fehlt eine Seite) – am Ende von Fall 16 angedeutet</w:t>
       </w:r>
     </w:p>
     <w:p>
@@ -856,7 +864,7 @@
         <w:rPr>
           <w:b w:val="0"/>
         </w:rPr>
-        <w:t>Dasselbe geht für „Mit Gardinen ins Jenseits“, Fall 16 Helgoland (am 1. März 1952 geben die Briten die zerbombte Insel zurück; ein junger Hummerfischer gehört zu den Ersten an Land und vergräbt eine Kiste unter dem Oberland; Testament: Holt sie raus und gebt sie dem, dem sie gehört, es ist nicht meine), mit Abschnitt 5.</w:t>
+        <w:t>Dasselbe geht für „Mit Gardinen ins Jenseits“, Fall 17 Sächsische Schweiz (Bad Schandau; am 11. August 1961, zwei Tage vor dem Mauerbau, steigen zwei Bergsteiger auf den Falkenstein, nur einer kommt herunter, im Gipfelbuch fehlt die Seite; Testament: Schreibt Karls Namen ins Buch, er war oben), mit Abschnitt 5.</w:t>
       </w:r>
     </w:p>
     <w:p>

</xml_diff>

<commit_message>
Alles muss raus Band 17: Sonderposten (Bamberg)
Co-Authored-By: Claude Opus 5.5 <noreply@anthropic.com>
Claude-Session: https://claude.ai/code/session_01Rqm6WzG9kWnhYjBnATSipi
</commit_message>
<xml_diff>
--- a/downloads/Uebersicht-und-Anleitung.docx
+++ b/downloads/Uebersicht-und-Anleitung.docx
@@ -448,7 +448,15 @@
         <w:pStyle w:val="ListBullet"/>
       </w:pPr>
       <w:r>
-        <w:t>Geplant: Band 17 Sonderposten – Felsenkeller in Bamberg, ein Fass läuft aus (am Ende von Band 16 angedeutet)</w:t>
+        <w:t>Band 17: Sonderposten (Felsenkeller, Bamberg)</w:t>
+      </w:r>
+    </w:p>
+    <w:p>
+      <w:pPr>
+        <w:pStyle w:val="ListBullet"/>
+      </w:pPr>
+      <w:r>
+        <w:t>Geplant: Band 18 Lagerräumung – Burgruine im Pfälzerwald, ein Eimer kommt aus dem Brunnen (am Ende von Band 17 angedeutet)</w:t>
       </w:r>
     </w:p>
     <w:p>
@@ -856,7 +864,7 @@
         <w:rPr>
           <w:b w:val="0"/>
         </w:rPr>
-        <w:t>„Schreibe Band 17 der Krimireihe ‚Alles muss raus – Ein Krimi zum Mitraten‘ von Jette van Hoven. Titel: Sonderposten. Ort: eine kleine Brauerei in der Altstadt von Bamberg mit einem Felsenkeller tief im Berg; ganz hinten steht ein altes Eichenfass, auf dem seit 1972 mit Kreide steht: Nicht anzapfen; der Brauer ist gestorben, und jetzt läuft das Fass aus, und es ist kein Bier. Auf dem Armaturenbrett des Kuckucks sitzen jetzt die Kuckucksuhr, ein geschnitzter Vogel, ein Glasauge aus Lauscha, ein Seiltänzer-Gartenzwerg, ein Messingknopf mit Pfeil nach unten, ein Rettungsring aus Kork, ein Mehlsäckchen und ein winziges Einweckglas mit einer Holzgurke. Halte dich genau an diese Anleitung (Abschnitt 4): Figuren, Aufbau mit 14 Kapiteln, ca. 15.000 Wörter, 7 bis 10 Dokumente zum Mitraten, 6 Bildplätze, Seite ‚Jetzt bist du dran‘ mit 6 Fragen, ‚Bettys Liste‘ als Tabelle, Ende mit Anruf zum nächsten Band. Gemütlich, humorvoll, faires Rätsel, keine Hexen, keine giftigen Pflanzen, unauffällig vegan. Deutsch, einfache klare Sätze, Du-Form nur in der Rätselseite.“</w:t>
+        <w:t>„Schreibe Band 18 der Krimireihe ‚Alles muss raus – Ein Krimi zum Mitraten‘ von Jette van Hoven. Titel: Lagerräumung. Ort: eine Burgruine im Pfälzerwald hoch über den Bäumen; im Burghof ein Brunnen, sechzig Meter tief, mit einem Gitter darüber; seit 1983 hängt unten ein Eimer an einer Kette, keiner hat ihn je hochgezogen, und eines Morgens steht er oben am Rand, voll, und es ist kein Wasser drin. Auf dem Armaturenbrett des Kuckucks sitzen jetzt die Kuckucksuhr, ein geschnitzter Vogel, ein Glasauge aus Lauscha, ein Seiltänzer-Gartenzwerg, ein Messingknopf mit Pfeil nach unten, ein Rettungsring aus Kork, ein Mehlsäckchen, ein winziges Einweckglas mit einer Holzgurke und ein Bierdeckel mit einem schwarzen Kater. Halte dich genau an diese Anleitung (Abschnitt 4): Figuren, Aufbau mit 14 Kapiteln, ca. 15.000 Wörter, 7 bis 10 Dokumente zum Mitraten, 6 Bildplätze, Seite ‚Jetzt bist du dran‘ mit 6 Fragen, ‚Bettys Liste‘ als Tabelle, Ende mit Anruf zum nächsten Band. Gemütlich, humorvoll, faires Rätsel, keine Hexen, keine giftigen Pflanzen, unauffällig vegan. Deutsch, einfache klare Sätze, Du-Form nur in der Rätselseite.“</w:t>
       </w:r>
     </w:p>
     <w:p>

</xml_diff>

<commit_message>
Mit Gardinen ins Jenseits Fall 17: Karl war oben (Sächsische Schweiz)
Co-Authored-By: Claude Opus 5.5 <noreply@anthropic.com>
Claude-Session: https://claude.ai/code/session_01Rqm6WzG9kWnhYjBnATSipi
</commit_message>
<xml_diff>
--- a/downloads/Uebersicht-und-Anleitung.docx
+++ b/downloads/Uebersicht-und-Anleitung.docx
@@ -304,7 +304,15 @@
         <w:pStyle w:val="ListBullet"/>
       </w:pPr>
       <w:r>
-        <w:t>Geplant: Fall 17 Sächsische Schweiz (Gipfelbuch auf dem Falkenstein, 1961 fehlt eine Seite) – am Ende von Fall 16 angedeutet</w:t>
+        <w:t>Fall 17: Karl war oben (Sächsische Schweiz)</w:t>
+      </w:r>
+    </w:p>
+    <w:p>
+      <w:pPr>
+        <w:pStyle w:val="ListBullet"/>
+      </w:pPr>
+      <w:r>
+        <w:t>Geplant: Fall 18 Schwäbische Alb (verlassenes Dorf Gruorn, eine Schultafel von 1939) – am Ende von Fall 17 angedeutet</w:t>
       </w:r>
     </w:p>
     <w:p>
@@ -872,7 +880,7 @@
         <w:rPr>
           <w:b w:val="0"/>
         </w:rPr>
-        <w:t>Dasselbe geht für „Mit Gardinen ins Jenseits“, Fall 17 Sächsische Schweiz (Bad Schandau; am 11. August 1961, zwei Tage vor dem Mauerbau, steigen zwei Bergsteiger auf den Falkenstein, nur einer kommt herunter, im Gipfelbuch fehlt die Seite; Testament: Schreibt Karls Namen ins Buch, er war oben), mit Abschnitt 5.</w:t>
+        <w:t>Dasselbe geht für „Mit Gardinen ins Jenseits“, Fall 18 Schwäbische Alb (Münsingen; im Dorf Gruorn, das 1939 für einen Truppenübungsplatz geräumt wurde, stehen nur noch Kirche und Schulhaus; an der Schultafel steht seit 1939 ein Satz in der Schrift eines vierzehnjährigen Mädchens, das jetzt mit 102 gestorben ist; Testament: Wischt die Tafel ab, erst dann ist die Schule aus), mit Abschnitt 5.</w:t>
       </w:r>
     </w:p>
     <w:p>

</xml_diff>